<commit_message>
Final submission: Complete project with diary, README, and video link
</commit_message>
<xml_diff>
--- a/Learning_Diary.docx
+++ b/Learning_Diary.docx
@@ -8,54 +8,30 @@
           <w:lang w:val="en-GB"/>
         </w:rPr>
       </w:pPr>
-      <w:proofErr w:type="spellStart"/>
-      <w:r>
-        <w:rPr>
-          <w:lang w:val="en-GB"/>
-        </w:rPr>
-        <w:t>Lappeenrannan</w:t>
-      </w:r>
-      <w:proofErr w:type="spellEnd"/>
-      <w:r>
-        <w:rPr>
-          <w:lang w:val="en-GB"/>
-        </w:rPr>
-        <w:t xml:space="preserve"> </w:t>
-      </w:r>
-      <w:proofErr w:type="spellStart"/>
-      <w:r>
-        <w:rPr>
-          <w:lang w:val="en-GB"/>
-        </w:rPr>
-        <w:t>teknillinen</w:t>
-      </w:r>
-      <w:proofErr w:type="spellEnd"/>
-      <w:r>
-        <w:rPr>
-          <w:lang w:val="en-GB"/>
-        </w:rPr>
-        <w:t xml:space="preserve"> </w:t>
-      </w:r>
-      <w:proofErr w:type="spellStart"/>
-      <w:r>
-        <w:rPr>
-          <w:lang w:val="en-GB"/>
-        </w:rPr>
-        <w:t>yliopisto</w:t>
-      </w:r>
-      <w:proofErr w:type="spellEnd"/>
-    </w:p>
-    <w:p>
-      <w:pPr>
-        <w:rPr>
-          <w:lang w:val="en-GB"/>
-        </w:rPr>
-      </w:pPr>
-      <w:r>
-        <w:rPr>
-          <w:lang w:val="en-GB"/>
-        </w:rPr>
-        <w:t>Computational science and artificial intelligence</w:t>
+      <w:r>
+        <w:rPr>
+          <w:lang w:val="en-GB"/>
+        </w:rPr>
+        <w:t>Lappeenrannan teknillinen yliopisto</w:t>
+      </w:r>
+    </w:p>
+    <w:p>
+      <w:pPr>
+        <w:rPr>
+          <w:lang w:val="en-GB"/>
+        </w:rPr>
+      </w:pPr>
+      <w:r>
+        <w:rPr>
+          <w:lang w:val="en-GB"/>
+        </w:rPr>
+        <w:t>L</w:t>
+      </w:r>
+      <w:r>
+        <w:rPr>
+          <w:lang w:val="en-GB"/>
+        </w:rPr>
+        <w:t>ENS</w:t>
       </w:r>
     </w:p>
     <w:p>
@@ -120,19 +96,7 @@
         <w:rPr>
           <w:lang w:val="en-GB"/>
         </w:rPr>
-        <w:t>Date: 2</w:t>
-      </w:r>
-      <w:r>
-        <w:rPr>
-          <w:lang w:val="en-GB"/>
-        </w:rPr>
-        <w:t>4</w:t>
-      </w:r>
-      <w:r>
-        <w:rPr>
-          <w:lang w:val="en-GB"/>
-        </w:rPr>
-        <w:t>.2.2026</w:t>
+        <w:t>Date: 25.2.2026</w:t>
       </w:r>
     </w:p>
     <w:p>
@@ -171,35 +135,368 @@
         <w:rPr>
           <w:lang w:val="en-GB"/>
         </w:rPr>
-        <w:t>I checked the general information and understood the main focus of the course, which is to combine HTML, CSS, and JavaScript to create various effects. I set up my environment using VS Code and Git. I created my GitHub repository (SDS-</w:t>
-      </w:r>
-      <w:proofErr w:type="spellStart"/>
-      <w:r>
-        <w:rPr>
-          <w:lang w:val="en-GB"/>
-        </w:rPr>
-        <w:t>FrontEnd</w:t>
-      </w:r>
-      <w:proofErr w:type="spellEnd"/>
-      <w:r>
-        <w:rPr>
-          <w:lang w:val="en-GB"/>
-        </w:rPr>
-        <w:t>-</w:t>
-      </w:r>
-      <w:proofErr w:type="spellStart"/>
-      <w:r>
-        <w:rPr>
-          <w:lang w:val="en-GB"/>
-        </w:rPr>
-        <w:t>MdMaksudurRahmanMahi</w:t>
-      </w:r>
-      <w:proofErr w:type="spellEnd"/>
-      <w:r>
-        <w:rPr>
-          <w:lang w:val="en-GB"/>
-        </w:rPr>
-        <w:t>) and learned to initialize a git repository. I also watched the introduction video to understand what responsive design looks like.</w:t>
+        <w:t>I checked the general information and understood the main focus of the course, which is to combine HTML, CSS, and JavaScript to create various effects in web pages. I set up my environment using VS Code and Git. I created my GitHub repository (SDS-FrontEnd-MdMaksudurRahmanMahi) and learned to initialize a git repository. I also watched the introduction video to understand what responsive design looks like.</w:t>
+      </w:r>
+    </w:p>
+    <w:p>
+      <w:pPr>
+        <w:rPr>
+          <w:lang w:val="en-GB"/>
+        </w:rPr>
+      </w:pPr>
+    </w:p>
+    <w:p>
+      <w:pPr>
+        <w:rPr>
+          <w:lang w:val="en-GB"/>
+        </w:rPr>
+      </w:pPr>
+      <w:r>
+        <w:rPr>
+          <w:lang w:val="en-GB"/>
+        </w:rPr>
+        <w:t>Date: 25.2.2026</w:t>
+      </w:r>
+    </w:p>
+    <w:p>
+      <w:pPr>
+        <w:rPr>
+          <w:lang w:val="en-GB"/>
+        </w:rPr>
+      </w:pPr>
+      <w:r>
+        <w:rPr>
+          <w:lang w:val="en-GB"/>
+        </w:rPr>
+        <w:t xml:space="preserve">Activity: HTML Markup and Core CSS  &amp; Buttons &amp; Utility Classes </w:t>
+      </w:r>
+    </w:p>
+    <w:p>
+      <w:pPr>
+        <w:rPr>
+          <w:lang w:val="en-GB"/>
+        </w:rPr>
+      </w:pPr>
+      <w:r>
+        <w:rPr>
+          <w:lang w:val="en-GB"/>
+        </w:rPr>
+        <w:t xml:space="preserve">Learning outcome: </w:t>
+      </w:r>
+    </w:p>
+    <w:p>
+      <w:pPr>
+        <w:rPr>
+          <w:lang w:val="en-GB"/>
+        </w:rPr>
+      </w:pPr>
+      <w:r>
+        <w:rPr>
+          <w:lang w:val="en-GB"/>
+        </w:rPr>
+        <w:t>I created the homepage HTML markup with proper semantic structure including navigation, hero section, cards, FAQ, and footer. I learned about CSS variables for maintaining consistent colors and styling. I created the core CSS with responsive navigation including a hamburger menu for mobile devices. I styled buttons using utility classes and learned about CSS nesting principles.</w:t>
+      </w:r>
+    </w:p>
+    <w:p>
+      <w:pPr>
+        <w:rPr>
+          <w:lang w:val="en-GB"/>
+        </w:rPr>
+      </w:pPr>
+    </w:p>
+    <w:p>
+      <w:pPr>
+        <w:rPr>
+          <w:lang w:val="en-GB"/>
+        </w:rPr>
+      </w:pPr>
+      <w:r>
+        <w:rPr>
+          <w:lang w:val="en-GB"/>
+        </w:rPr>
+        <w:t>Date: 25.2.2026</w:t>
+      </w:r>
+    </w:p>
+    <w:p>
+      <w:pPr>
+        <w:rPr>
+          <w:lang w:val="en-GB"/>
+        </w:rPr>
+      </w:pPr>
+      <w:r>
+        <w:rPr>
+          <w:lang w:val="en-GB"/>
+        </w:rPr>
+        <w:t xml:space="preserve">Activity: CSS Grid &amp; Cards </w:t>
+      </w:r>
+    </w:p>
+    <w:p>
+      <w:pPr>
+        <w:rPr>
+          <w:lang w:val="en-GB"/>
+        </w:rPr>
+      </w:pPr>
+      <w:r>
+        <w:rPr>
+          <w:lang w:val="en-GB"/>
+        </w:rPr>
+        <w:t xml:space="preserve">Learning outcome: </w:t>
+      </w:r>
+    </w:p>
+    <w:p>
+      <w:pPr>
+        <w:rPr>
+          <w:lang w:val="en-GB"/>
+        </w:rPr>
+      </w:pPr>
+      <w:r>
+        <w:rPr>
+          <w:lang w:val="en-GB"/>
+        </w:rPr>
+        <w:t>I created card components for displaying projects/products. I learned to use CSS Grid to display cards uniformly on the page with responsive columns using grid-template-columns: repeat(auto-fit, minmax(250px, 1fr)). This allows the grid to automatically adjust based on screen size. I added content and shop elements to the site with proper spacing and visual hierarchy.</w:t>
+      </w:r>
+    </w:p>
+    <w:p>
+      <w:pPr>
+        <w:rPr>
+          <w:lang w:val="en-GB"/>
+        </w:rPr>
+      </w:pPr>
+    </w:p>
+    <w:p>
+      <w:pPr>
+        <w:rPr>
+          <w:lang w:val="en-GB"/>
+        </w:rPr>
+      </w:pPr>
+      <w:r>
+        <w:rPr>
+          <w:lang w:val="en-GB"/>
+        </w:rPr>
+        <w:t>Date: 25.2.2026</w:t>
+      </w:r>
+    </w:p>
+    <w:p>
+      <w:pPr>
+        <w:rPr>
+          <w:lang w:val="en-GB"/>
+        </w:rPr>
+      </w:pPr>
+      <w:r>
+        <w:rPr>
+          <w:lang w:val="en-GB"/>
+        </w:rPr>
+        <w:t xml:space="preserve">Activity: FAQ Elements </w:t>
+      </w:r>
+    </w:p>
+    <w:p>
+      <w:pPr>
+        <w:rPr>
+          <w:lang w:val="en-GB"/>
+        </w:rPr>
+      </w:pPr>
+      <w:r>
+        <w:rPr>
+          <w:lang w:val="en-GB"/>
+        </w:rPr>
+        <w:t xml:space="preserve">Learning outcome: </w:t>
+      </w:r>
+    </w:p>
+    <w:p>
+      <w:pPr>
+        <w:rPr>
+          <w:lang w:val="en-GB"/>
+        </w:rPr>
+      </w:pPr>
+      <w:r>
+        <w:rPr>
+          <w:lang w:val="en-GB"/>
+        </w:rPr>
+        <w:t>I added a FAQ section with interactive accordion functionality. I learned to create expanding content sections using CSS transitions and JavaScript event listeners. When a user clicks on a FAQ question, the answer expands smoothly. I also added a footer with navigation links and social media placeholders.</w:t>
+      </w:r>
+    </w:p>
+    <w:p>
+      <w:pPr>
+        <w:rPr>
+          <w:lang w:val="en-GB"/>
+        </w:rPr>
+      </w:pPr>
+    </w:p>
+    <w:p>
+      <w:pPr>
+        <w:rPr>
+          <w:lang w:val="en-GB"/>
+        </w:rPr>
+      </w:pPr>
+      <w:r>
+        <w:rPr>
+          <w:lang w:val="en-GB"/>
+        </w:rPr>
+        <w:t>Date: 25.2.2026</w:t>
+      </w:r>
+    </w:p>
+    <w:p>
+      <w:pPr>
+        <w:rPr>
+          <w:lang w:val="en-GB"/>
+        </w:rPr>
+      </w:pPr>
+      <w:r>
+        <w:rPr>
+          <w:lang w:val="en-GB"/>
+        </w:rPr>
+        <w:t xml:space="preserve">Activity: Mobile Menu &amp; Responsiveness </w:t>
+      </w:r>
+    </w:p>
+    <w:p>
+      <w:pPr>
+        <w:rPr>
+          <w:lang w:val="en-GB"/>
+        </w:rPr>
+      </w:pPr>
+      <w:r>
+        <w:rPr>
+          <w:lang w:val="en-GB"/>
+        </w:rPr>
+        <w:t xml:space="preserve">Learning outcome: </w:t>
+      </w:r>
+    </w:p>
+    <w:p>
+      <w:pPr>
+        <w:rPr>
+          <w:lang w:val="en-GB"/>
+        </w:rPr>
+      </w:pPr>
+      <w:r>
+        <w:rPr>
+          <w:lang w:val="en-GB"/>
+        </w:rPr>
+        <w:t>I implemented responsiveness for mobile screens using media queries. I learned to use @media (max-width: 768px) to adjust the layout for smaller devices. The navigation transforms into a mobile hamburger menu that toggles on click. I tested the website on different screen sizes to ensure proper responsiveness.</w:t>
+      </w:r>
+    </w:p>
+    <w:p>
+      <w:pPr>
+        <w:rPr>
+          <w:lang w:val="en-GB"/>
+        </w:rPr>
+      </w:pPr>
+    </w:p>
+    <w:p>
+      <w:pPr>
+        <w:rPr>
+          <w:lang w:val="en-GB"/>
+        </w:rPr>
+      </w:pPr>
+      <w:r>
+        <w:rPr>
+          <w:lang w:val="en-GB"/>
+        </w:rPr>
+        <w:t>Date: 25.2.2026</w:t>
+      </w:r>
+    </w:p>
+    <w:p>
+      <w:pPr>
+        <w:rPr>
+          <w:lang w:val="en-GB"/>
+        </w:rPr>
+      </w:pPr>
+      <w:r>
+        <w:rPr>
+          <w:lang w:val="en-GB"/>
+        </w:rPr>
+        <w:t>Activity: Website Deployment with GitHub Pages</w:t>
+      </w:r>
+    </w:p>
+    <w:p>
+      <w:pPr>
+        <w:rPr>
+          <w:lang w:val="en-GB"/>
+        </w:rPr>
+      </w:pPr>
+      <w:r>
+        <w:rPr>
+          <w:lang w:val="en-GB"/>
+        </w:rPr>
+        <w:t xml:space="preserve">Learning outcome: </w:t>
+      </w:r>
+    </w:p>
+    <w:p>
+      <w:pPr>
+        <w:rPr>
+          <w:lang w:val="en-GB"/>
+        </w:rPr>
+      </w:pPr>
+      <w:r>
+        <w:rPr>
+          <w:lang w:val="en-GB"/>
+        </w:rPr>
+        <w:t>I learned to deploy my website using GitHub Pages. I configured the repository settings to deploy from the main branch root folder. I encountered and solved git merge conflicts when pushing to a repository that already had a README.md file. The site is now live at https://md-maksudur-rahman-mahi.github.io/SDS-FrontEnd-MdMaksudurRahmanMahi/</w:t>
+      </w:r>
+    </w:p>
+    <w:p>
+      <w:pPr>
+        <w:rPr>
+          <w:lang w:val="en-GB"/>
+        </w:rPr>
+      </w:pPr>
+    </w:p>
+    <w:p>
+      <w:pPr>
+        <w:rPr>
+          <w:lang w:val="en-GB"/>
+        </w:rPr>
+      </w:pPr>
+      <w:r>
+        <w:rPr>
+          <w:lang w:val="en-GB"/>
+        </w:rPr>
+        <w:t>Date: 25.2.2026</w:t>
+      </w:r>
+    </w:p>
+    <w:p>
+      <w:pPr>
+        <w:rPr>
+          <w:lang w:val="en-GB"/>
+        </w:rPr>
+      </w:pPr>
+      <w:r>
+        <w:rPr>
+          <w:lang w:val="en-GB"/>
+        </w:rPr>
+        <w:t>Activity: Project Completion and Documentation</w:t>
+      </w:r>
+    </w:p>
+    <w:p>
+      <w:pPr>
+        <w:rPr>
+          <w:lang w:val="en-GB"/>
+        </w:rPr>
+      </w:pPr>
+      <w:r>
+        <w:rPr>
+          <w:lang w:val="en-GB"/>
+        </w:rPr>
+        <w:t xml:space="preserve">Learning outcome: </w:t>
+      </w:r>
+    </w:p>
+    <w:p>
+      <w:pPr>
+        <w:rPr>
+          <w:lang w:val="en-GB"/>
+        </w:rPr>
+      </w:pPr>
+      <w:r>
+        <w:rPr>
+          <w:lang w:val="en-GB"/>
+        </w:rPr>
+        <w:t xml:space="preserve">I completed all project requirements: responsive navigation, CSS Grid and Flexbox layouts, interactive elements, and mobile responsiveness. I created a README.md with </w:t>
+      </w:r>
+      <w:r>
+        <w:rPr>
+          <w:lang w:val="en-GB"/>
+        </w:rPr>
+        <w:lastRenderedPageBreak/>
+        <w:t>project description, live demo link, and instructions. I documented all my learning in this diary and prepared for video recording of the project.</w:t>
       </w:r>
     </w:p>
     <w:sectPr>

</xml_diff>